<commit_message>
Add team details to the report and README
</commit_message>
<xml_diff>
--- a/docs/Project_Report.docx
+++ b/docs/Project_Report.docx
@@ -173,19 +173,7 @@
         <w:t xml:space="preserve"> </w:t>
       </w:r>
       <w:r>
-        <w:t xml:space="preserve">(Roll</w:t>
-      </w:r>
-      <w:r>
-        <w:t xml:space="preserve"> </w:t>
-      </w:r>
-      <w:r>
-        <w:t xml:space="preserve">no.</w:t>
-      </w:r>
-      <w:r>
-        <w:t xml:space="preserve"> </w:t>
-      </w:r>
-      <w:r>
-        <w:t xml:space="preserve">______)</w:t>
+        <w:t xml:space="preserve">(16010123341)</w:t>
       </w:r>
     </w:p>
     <w:p>
@@ -193,25 +181,19 @@
         <w:pStyle w:val="Author"/>
       </w:pPr>
       <w:r>
-        <w:t xml:space="preserve">______________</w:t>
-      </w:r>
-      <w:r>
-        <w:t xml:space="preserve"> </w:t>
-      </w:r>
-      <w:r>
-        <w:t xml:space="preserve">(Roll</w:t>
-      </w:r>
-      <w:r>
-        <w:t xml:space="preserve"> </w:t>
-      </w:r>
-      <w:r>
-        <w:t xml:space="preserve">no.</w:t>
-      </w:r>
-      <w:r>
-        <w:t xml:space="preserve"> </w:t>
-      </w:r>
-      <w:r>
-        <w:t xml:space="preserve">______)</w:t>
+        <w:t xml:space="preserve">Shubhpreet</w:t>
+      </w:r>
+      <w:r>
+        <w:t xml:space="preserve"> </w:t>
+      </w:r>
+      <w:r>
+        <w:t xml:space="preserve">Kaur</w:t>
+      </w:r>
+      <w:r>
+        <w:t xml:space="preserve"> </w:t>
+      </w:r>
+      <w:r>
+        <w:t xml:space="preserve">(16010123328)</w:t>
       </w:r>
     </w:p>
     <w:p>
@@ -219,67 +201,25 @@
         <w:pStyle w:val="Author"/>
       </w:pPr>
       <w:r>
-        <w:t xml:space="preserve">______________</w:t>
-      </w:r>
-      <w:r>
-        <w:t xml:space="preserve"> </w:t>
-      </w:r>
-      <w:r>
-        <w:t xml:space="preserve">(Roll</w:t>
-      </w:r>
-      <w:r>
-        <w:t xml:space="preserve"> </w:t>
-      </w:r>
-      <w:r>
-        <w:t xml:space="preserve">no.</w:t>
-      </w:r>
-      <w:r>
-        <w:t xml:space="preserve"> </w:t>
-      </w:r>
-      <w:r>
-        <w:t xml:space="preserve">______)</w:t>
+        <w:t xml:space="preserve">Aditi</w:t>
+      </w:r>
+      <w:r>
+        <w:t xml:space="preserve"> </w:t>
+      </w:r>
+      <w:r>
+        <w:t xml:space="preserve">Agarwal</w:t>
+      </w:r>
+      <w:r>
+        <w:t xml:space="preserve"> </w:t>
+      </w:r>
+      <w:r>
+        <w:t xml:space="preserve">(16010123018)</w:t>
       </w:r>
     </w:p>
     <w:p>
       <w:pPr>
         <w:pStyle w:val="Date"/>
       </w:pPr>
-      <w:r>
-        <w:t xml:space="preserve">Batch</w:t>
-      </w:r>
-      <w:r>
-        <w:t xml:space="preserve"> </w:t>
-      </w:r>
-      <w:r>
-        <w:t xml:space="preserve">______</w:t>
-      </w:r>
-      <w:r>
-        <w:t xml:space="preserve"> </w:t>
-      </w:r>
-      <w:r>
-        <w:t xml:space="preserve">·</w:t>
-      </w:r>
-      <w:r>
-        <w:t xml:space="preserve"> </w:t>
-      </w:r>
-      <w:r>
-        <w:t xml:space="preserve">Guide:</w:t>
-      </w:r>
-      <w:r>
-        <w:t xml:space="preserve"> </w:t>
-      </w:r>
-      <w:r>
-        <w:t xml:space="preserve">______________</w:t>
-      </w:r>
-      <w:r>
-        <w:t xml:space="preserve"> </w:t>
-      </w:r>
-      <w:r>
-        <w:t xml:space="preserve">·</w:t>
-      </w:r>
-      <w:r>
-        <w:t xml:space="preserve"> </w:t>
-      </w:r>
       <w:r>
         <w:t xml:space="preserve">October</w:t>
       </w:r>

</xml_diff>